<commit_message>
S53: Correct MK-P1 Type F claim count and naming convention
- Replace 9 F-type claims with 6 ground-truth claims from prose
- Rename C-MK1.x → F-MK1.x per DRS type-prefix convention
- Remove phantom entries F-MK1.7, F-MK1.8, F-MK1.9 (no prose source)
- Update AI-reader header: Type F 4→6, Total 9→18 (6A+6D+6F)
- Add patch record MK-P1-PATCH-001 to _meta
- Update claim-registry-index.md: MK-P1 block + total 155→152
- Update MK-P1-GeneralTheory-DRS.docx: header table, claim box
  labels, corrections register entry

https://claude.ai/code/session_01EG2qjoEAHHr6zNnawKqTPh
</commit_message>
<xml_diff>
--- a/paper/meta-kaizen/MK-P1-GeneralTheory-DRS.docx
+++ b/paper/meta-kaizen/MK-P1-GeneralTheory-DRS.docx
@@ -422,7 +422,7 @@
           </w:tcPr>
           <w:p>
             <w:r>
-              <w:t xml:space="preserve">4 (all with 5-part FALSIFIED IF predicates)</w:t>
+              <w:t>6 (all with 5-part FALSIFIED IF predicates)</w:t>
             </w:r>
           </w:p>
         </w:tc>
@@ -470,7 +470,7 @@
           </w:tcPr>
           <w:p>
             <w:r>
-              <w:t xml:space="preserve">9</w:t>
+              <w:t>18 (6A + 6D + 6F — pending CBT verification)</w:t>
             </w:r>
           </w:p>
         </w:tc>
@@ -894,7 +894,7 @@
         <w:spacing w:after="160"/>
       </w:pPr>
       <w:r>
-        <w:t xml:space="preserve">The resulting form is KVS_j = N_j × I'_j × C'_j × T_j with all components normalized to [0,1]. This is Claim C-MK1.1 in the AI layer. The alpha = 1 exponent selection is a parsimony modeling choice, explicitly not a derived result.</w:t>
+        <w:t>The resulting form is KVS_j = N_j × I'_j × C'_j × T_j with all components normalized to [0,1]. This is Claim F-MK1.1 (formerly C-MK1.1) in the AI layer. The alpha = 1 exponent selection is a parsimony modeling choice, explicitly not a derived result.</w:t>
       </w:r>
     </w:p>
     <w:p>
@@ -944,7 +944,7 @@
                 <w:b/>
                 <w:bCs/>
               </w:rPr>
-              <w:t xml:space="preserve">Claim C-MK1.1: Multiplicative functional form — uniqueness</w:t>
+              <w:t>Claim F-MK1.1 (formerly C-MK1.1): Multiplicative functional form — uniqueness</w:t>
             </w:r>
           </w:p>
           <w:p>
@@ -1092,7 +1092,7 @@
                 <w:b/>
                 <w:bCs/>
               </w:rPr>
-              <w:t xml:space="preserve">Claim C-MK1.3: Adoption threshold κ=0.50 derivation</w:t>
+              <w:t>Claim F-MK1.3 (formerly C-MK1.3): Adoption threshold κ=0.50 derivation</w:t>
             </w:r>
           </w:p>
           <w:p>
@@ -1371,7 +1371,7 @@
         <w:t xml:space="preserve">Result: </w:t>
       </w:r>
       <w:r>
-        <w:t xml:space="preserve">73.8% recall [90% CI: 71.2, 76.2] (Claim C-MK1.4). </w:t>
+        <w:t xml:space="preserve">73.8% recall [90% CI: 71.2, 76.2] (Claim F-MK1.4 (formerly C-MK1.4)). </w:t>
       </w:r>
     </w:p>
     <w:p>
@@ -1451,7 +1451,7 @@
                 <w:b/>
                 <w:bCs/>
               </w:rPr>
-              <w:t xml:space="preserve">Claim C-MK1.4: Simulation recall 73.8%</w:t>
+              <w:t>Claim F-MK1.4 (formerly C-MK1.4): Simulation recall 73.8%</w:t>
             </w:r>
           </w:p>
           <w:p>
@@ -2113,7 +2113,15 @@
         <w:spacing w:after="160"/>
       </w:pPr>
       <w:r>
-        <w:t xml:space="preserve">No corrections from prior drafts in this version — this is the first DRS-revised version of MK-P1.</w:t>
+        <w:t>Correction 2 (S53): Type F claim count and naming convention</w:t>
+        <w:br/>
+        <w:t>Prior AI-reader header stated Type F claims: 4. Prose contained six claims with full 5-part FALSIFIED IF predicates. Count corrected to 6.</w:t>
+        <w:br/>
+        <w:t>Claim IDs renamed from C-MK1.x to F-MK1.x throughout, per DRS type-prefix convention (F=Falsifiable, D=Definition, A=Axiom). Crosswalk from old to new IDs: C-MK1.1→F-MK1.1, C-MK1.2→F-MK1.2, C-MK1.3→F-MK1.3, C-MK1.4→F-MK1.4, C-MK1.5→F-MK1.5, C-MK1.6→F-MK1.6.</w:t>
+        <w:br/>
+        <w:t>Registry entries F-MK1.7, F-MK1.8, F-MK1.9 removed — no corresponding prose claims found; presumed phantom entries from prior draft projection.</w:t>
+        <w:br/>
+        <w:t>Total claim count header updated from 9 to 18 pending CBT verification.</w:t>
       </w:r>
     </w:p>
     <w:p>
@@ -2191,7 +2199,7 @@
         <w:rPr>
           <w:b/>
         </w:rPr>
-        <w:t>Additional Type F Claims (C-MK1.2, C-MK1.5, C-MK1.6)</w:t>
+        <w:t>Additional Type F Claims (F-MK1.2 (formerly C-MK1.2), F-MK1.5 (formerly C-MK1.5), F-MK1.6 (formerly C-MK1.6))</w:t>
       </w:r>
     </w:p>
     <w:tbl>
@@ -2229,7 +2237,7 @@
           </w:tcPr>
           <w:p>
             <w:r>
-              <w:t>Claim C-MK1.2: Equal weights derivation</w:t>
+              <w:t>Claim F-MK1.2 (formerly C-MK1.2): Equal weights derivation</w:t>
             </w:r>
           </w:p>
           <w:p>
@@ -2300,7 +2308,7 @@
           </w:tcPr>
           <w:p>
             <w:r>
-              <w:t>Claim C-MK1.5: KVS boundedness (Property 4.1)</w:t>
+              <w:t>Claim F-MK1.5 (formerly C-MK1.5): KVS boundedness (Property 4.1)</w:t>
             </w:r>
           </w:p>
           <w:p>
@@ -2371,7 +2379,7 @@
           </w:tcPr>
           <w:p>
             <w:r>
-              <w:t>Claim C-MK1.6: Self-referential applicability (Theorem 4.2)</w:t>
+              <w:t>Claim F-MK1.6 (formerly C-MK1.6): Self-referential applicability (Theorem 4.2)</w:t>
             </w:r>
           </w:p>
           <w:p>

</xml_diff>